<commit_message>
docs: fix summary-doc one-liner clarity per §11.4.91 (7 anti-pattern rows)
Rewrote 7 terse one-liners that failed the §11.4.91 required shape (>=6 words
OR >=40 chars naming subject + problem/goal): HRD-007 in Issues_Summary; HRD-001..006
title array in Fixed_Summary. Every correction derived verbatim from the source
long-form Title in Issues.md/Fixed.md - none invented. Status_Summary already
compliant (no per-item one-liner rows). No summary generator exists yet (planned
HRD-037/047/048). HTML/PDF/DOCX siblings regenerated (§11.4.60).

§11.4.92: Pass-1 zero forbidden anti-patterns remain (grep); Pass-5 corrections
trace to real source headings, no fabrication.

Co-Authored-By: Claude Opus 4.7 <noreply@anthropic.com>
</commit_message>
<xml_diff>
--- a/docs/Fixed_Summary.docx
+++ b/docs/Fixed_Summary.docx
@@ -579,7 +579,7 @@
         <w:rPr>
           <w:rStyle w:val="VerbatimChar"/>
         </w:rPr>
-        <w:t xml:space="preserve">    { "id": "HRD-006", "closed": "2026-05-20", "commit": "f8b8073", "title": "V3 r2 flavor refinement" },</w:t>
+        <w:t xml:space="preserve">    { "id": "HRD-006", "closed": "2026-05-20", "commit": "f8b8073", "title": "V3 r2 flavor refinement — 9 flavors × per-channel interaction tables" },</w:t>
       </w:r>
       <w:r>
         <w:br/>
@@ -588,7 +588,7 @@
         <w:rPr>
           <w:rStyle w:val="VerbatimChar"/>
         </w:rPr>
-        <w:t xml:space="preserve">    { "id": "HRD-005", "closed": "2026-05-20", "commit": "e26a8dc", "title": "V3 r1 operator-product layer" },</w:t>
+        <w:t xml:space="preserve">    { "id": "HRD-005", "closed": "2026-05-20", "commit": "e26a8dc", "title": "V3 r1 operator-product layer (§31..§36 + §18.2 expansion)" },</w:t>
       </w:r>
       <w:r>
         <w:br/>
@@ -597,7 +597,7 @@
         <w:rPr>
           <w:rStyle w:val="VerbatimChar"/>
         </w:rPr>
-        <w:t xml:space="preserve">    { "id": "HRD-004", "closed": "2026-05-20", "commit": "f4ebba1", "title": "V2 r3 self-review" },</w:t>
+        <w:t xml:space="preserve">    { "id": "HRD-004", "closed": "2026-05-20", "commit": "f4ebba1", "title": "V2 r3 — Go type contract closure + operational ops detail" },</w:t>
       </w:r>
       <w:r>
         <w:br/>
@@ -606,7 +606,7 @@
         <w:rPr>
           <w:rStyle w:val="VerbatimChar"/>
         </w:rPr>
-        <w:t xml:space="preserve">    { "id": "HRD-003", "closed": "2026-05-19", "commit": "9648545", "title": "V2 r2 self-review" },</w:t>
+        <w:t xml:space="preserve">    { "id": "HRD-003", "closed": "2026-05-19", "commit": "9648545", "title": "V2 r2 — close prose↔definition gaps + add operational guidance" },</w:t>
       </w:r>
       <w:r>
         <w:br/>
@@ -615,7 +615,7 @@
         <w:rPr>
           <w:rStyle w:val="VerbatimChar"/>
         </w:rPr>
-        <w:t xml:space="preserve">    { "id": "HRD-002", "closed": "2026-05-19", "commit": "96b7cc6", "title": "V2 r1 architecture" },</w:t>
+        <w:t xml:space="preserve">    { "id": "HRD-002", "closed": "2026-05-19", "commit": "96b7cc6", "title": "V2 r1 — architectural authoring (CloudEvents/Watermill/OTel/RLS/SLSA/9 flavors)" },</w:t>
       </w:r>
       <w:r>
         <w:br/>
@@ -624,7 +624,7 @@
         <w:rPr>
           <w:rStyle w:val="VerbatimChar"/>
         </w:rPr>
-        <w:t xml:space="preserve">    { "id": "HRD-001", "closed": "2026-05-19", "commit": "b421fe1", "title": "V1 MVP specification" }</w:t>
+        <w:t xml:space="preserve">    { "id": "HRD-001", "closed": "2026-05-19", "commit": "b421fe1", "title": "V1 — initial MVP specification + Review section + Recommendations" }</w:t>
       </w:r>
       <w:r>
         <w:br/>

</xml_diff>